<commit_message>
Demo run: fix false alarms found during demo, add demo video and chat page
- Expand contractions (I'll, you're) in preprocessing so they no longer
  look like threat words
- SVM: when no category is confident, leftover probability goes to SAFE
- Above the warning threshold, label with the most likely toxic category;
  warning threshold raised from 40 to 50
- Extension: show the typing warning above the text box when there is no
  room below (chat apps)
- Dataset: 1160 messages, everyday safe messages, balanced group mentions,
  figurative 'killing me', apologies, key bullying phrases
- Regression test for everyday messages
- docs/demo: 79 s demo video, step screenshots, unseen-sentence test
- demo/chat.html for running the demo locally; README demo section

Co-Authored-By: Claude Opus 5.5 <noreply@anthropic.com>
Claude-Session: https://claude.ai/code/session_01HeWQMV62hmLxWcHtjFuzsM
</commit_message>
<xml_diff>
--- a/docs/SpeakSafe_Appendix.docx
+++ b/docs/SpeakSafe_Appendix.docx
@@ -1697,6 +1697,18 @@
           <w:rFonts w:ascii="Courier New" w:hAnsi="Courier New"/>
           <w:sz w:val="18"/>
         </w:rPr>
+        <w:t xml:space="preserve">        clean = expandContractions(clean);                          // you're -&gt; you are</w:t>
+      </w:r>
+    </w:p>
+    <w:p>
+      <w:pPr>
+        <w:spacing w:after="0" w:before="0"/>
+      </w:pPr>
+      <w:r>
+        <w:rPr>
+          <w:rFonts w:ascii="Courier New" w:hAnsi="Courier New"/>
+          <w:sz w:val="18"/>
+        </w:rPr>
         <w:t xml:space="preserve">        clean = normalizeLeetspeak(clean);                          // 1d10t -&gt; idiot</w:t>
       </w:r>
     </w:p>
@@ -1817,6 +1829,173 @@
           <w:sz w:val="18"/>
         </w:rPr>
         <w:t xml:space="preserve">        return tokens;</w:t>
+      </w:r>
+    </w:p>
+    <w:p>
+      <w:pPr>
+        <w:spacing w:after="0" w:before="0"/>
+      </w:pPr>
+      <w:r>
+        <w:rPr>
+          <w:rFonts w:ascii="Courier New" w:hAnsi="Courier New"/>
+          <w:sz w:val="18"/>
+        </w:rPr>
+        <w:t xml:space="preserve">    }</w:t>
+      </w:r>
+    </w:p>
+    <w:p>
+      <w:pPr>
+        <w:spacing w:after="0" w:before="0"/>
+      </w:pPr>
+      <w:r>
+        <w:rPr>
+          <w:rFonts w:ascii="Courier New" w:hAnsi="Courier New"/>
+          <w:sz w:val="18"/>
+        </w:rPr>
+      </w:r>
+    </w:p>
+    <w:p>
+      <w:pPr>
+        <w:spacing w:after="0" w:before="0"/>
+      </w:pPr>
+      <w:r>
+        <w:rPr>
+          <w:rFonts w:ascii="Courier New" w:hAnsi="Courier New"/>
+          <w:sz w:val="18"/>
+        </w:rPr>
+        <w:t xml:space="preserve">    /** Writes short forms out in full, so "I'll" and "you're" become real words instead of "ll" and "re". */</w:t>
+      </w:r>
+    </w:p>
+    <w:p>
+      <w:pPr>
+        <w:spacing w:after="0" w:before="0"/>
+      </w:pPr>
+      <w:r>
+        <w:rPr>
+          <w:rFonts w:ascii="Courier New" w:hAnsi="Courier New"/>
+          <w:sz w:val="18"/>
+        </w:rPr>
+        <w:t xml:space="preserve">    private String expandContractions(String text) {</w:t>
+      </w:r>
+    </w:p>
+    <w:p>
+      <w:pPr>
+        <w:spacing w:after="0" w:before="0"/>
+      </w:pPr>
+      <w:r>
+        <w:rPr>
+          <w:rFonts w:ascii="Courier New" w:hAnsi="Courier New"/>
+          <w:sz w:val="18"/>
+        </w:rPr>
+        <w:t xml:space="preserve">        return text.replace('\u2019', '\'')                       // curly apostrophe -&gt; straight</w:t>
+      </w:r>
+    </w:p>
+    <w:p>
+      <w:pPr>
+        <w:spacing w:after="0" w:before="0"/>
+      </w:pPr>
+      <w:r>
+        <w:rPr>
+          <w:rFonts w:ascii="Courier New" w:hAnsi="Courier New"/>
+          <w:sz w:val="18"/>
+        </w:rPr>
+        <w:t xml:space="preserve">                   .replaceAll("\\bcan't\\b", "can not")</w:t>
+      </w:r>
+    </w:p>
+    <w:p>
+      <w:pPr>
+        <w:spacing w:after="0" w:before="0"/>
+      </w:pPr>
+      <w:r>
+        <w:rPr>
+          <w:rFonts w:ascii="Courier New" w:hAnsi="Courier New"/>
+          <w:sz w:val="18"/>
+        </w:rPr>
+        <w:t xml:space="preserve">                   .replaceAll("\\bwon't\\b", "will not")</w:t>
+      </w:r>
+    </w:p>
+    <w:p>
+      <w:pPr>
+        <w:spacing w:after="0" w:before="0"/>
+      </w:pPr>
+      <w:r>
+        <w:rPr>
+          <w:rFonts w:ascii="Courier New" w:hAnsi="Courier New"/>
+          <w:sz w:val="18"/>
+        </w:rPr>
+        <w:t xml:space="preserve">                   .replaceAll("n't\\b", " not")</w:t>
+      </w:r>
+    </w:p>
+    <w:p>
+      <w:pPr>
+        <w:spacing w:after="0" w:before="0"/>
+      </w:pPr>
+      <w:r>
+        <w:rPr>
+          <w:rFonts w:ascii="Courier New" w:hAnsi="Courier New"/>
+          <w:sz w:val="18"/>
+        </w:rPr>
+        <w:t xml:space="preserve">                   .replaceAll("'re\\b", " are")</w:t>
+      </w:r>
+    </w:p>
+    <w:p>
+      <w:pPr>
+        <w:spacing w:after="0" w:before="0"/>
+      </w:pPr>
+      <w:r>
+        <w:rPr>
+          <w:rFonts w:ascii="Courier New" w:hAnsi="Courier New"/>
+          <w:sz w:val="18"/>
+        </w:rPr>
+        <w:t xml:space="preserve">                   .replaceAll("'ll\\b", " will")</w:t>
+      </w:r>
+    </w:p>
+    <w:p>
+      <w:pPr>
+        <w:spacing w:after="0" w:before="0"/>
+      </w:pPr>
+      <w:r>
+        <w:rPr>
+          <w:rFonts w:ascii="Courier New" w:hAnsi="Courier New"/>
+          <w:sz w:val="18"/>
+        </w:rPr>
+        <w:t xml:space="preserve">                   .replaceAll("'m\\b", " am")</w:t>
+      </w:r>
+    </w:p>
+    <w:p>
+      <w:pPr>
+        <w:spacing w:after="0" w:before="0"/>
+      </w:pPr>
+      <w:r>
+        <w:rPr>
+          <w:rFonts w:ascii="Courier New" w:hAnsi="Courier New"/>
+          <w:sz w:val="18"/>
+        </w:rPr>
+        <w:t xml:space="preserve">                   .replaceAll("'ve\\b", " have")</w:t>
+      </w:r>
+    </w:p>
+    <w:p>
+      <w:pPr>
+        <w:spacing w:after="0" w:before="0"/>
+      </w:pPr>
+      <w:r>
+        <w:rPr>
+          <w:rFonts w:ascii="Courier New" w:hAnsi="Courier New"/>
+          <w:sz w:val="18"/>
+        </w:rPr>
+        <w:t xml:space="preserve">                   .replaceAll("'d\\b", " would")</w:t>
+      </w:r>
+    </w:p>
+    <w:p>
+      <w:pPr>
+        <w:spacing w:after="0" w:before="0"/>
+      </w:pPr>
+      <w:r>
+        <w:rPr>
+          <w:rFonts w:ascii="Courier New" w:hAnsi="Courier New"/>
+          <w:sz w:val="18"/>
+        </w:rPr>
+        <w:t xml:space="preserve">                   .replaceAll("'s\\b", "");</w:t>
       </w:r>
     </w:p>
     <w:p>
@@ -4998,19 +5177,7 @@
           <w:rFonts w:ascii="Courier New" w:hAnsi="Courier New"/>
           <w:sz w:val="18"/>
         </w:rPr>
-        <w:t xml:space="preserve">        // An SVM gives distances, not probabilities. We squash each distance with a</w:t>
-      </w:r>
-    </w:p>
-    <w:p>
-      <w:pPr>
-        <w:spacing w:after="0" w:before="0"/>
-      </w:pPr>
-      <w:r>
-        <w:rPr>
-          <w:rFonts w:ascii="Courier New" w:hAnsi="Courier New"/>
-          <w:sz w:val="18"/>
-        </w:rPr>
-        <w:t xml:space="preserve">        // sigmoid and then rescale so all categories add up to 1.</w:t>
+        <w:t xml:space="preserve">        // An SVM gives distances, not probabilities. We squash each distance into 0..1 with a sigmoid.</w:t>
       </w:r>
     </w:p>
     <w:p>
@@ -5071,6 +5238,90 @@
           <w:sz w:val="18"/>
         </w:rPr>
         <w:t xml:space="preserve">            sum += p[c];</w:t>
+      </w:r>
+    </w:p>
+    <w:p>
+      <w:pPr>
+        <w:spacing w:after="0" w:before="0"/>
+      </w:pPr>
+      <w:r>
+        <w:rPr>
+          <w:rFonts w:ascii="Courier New" w:hAnsi="Courier New"/>
+          <w:sz w:val="18"/>
+        </w:rPr>
+        <w:t xml:space="preserve">        }</w:t>
+      </w:r>
+    </w:p>
+    <w:p>
+      <w:pPr>
+        <w:spacing w:after="0" w:before="0"/>
+      </w:pPr>
+      <w:r>
+        <w:rPr>
+          <w:rFonts w:ascii="Courier New" w:hAnsi="Courier New"/>
+          <w:sz w:val="18"/>
+        </w:rPr>
+        <w:t xml:space="preserve">        // If no category is confident (total below 1), the message is unlike anything toxic</w:t>
+      </w:r>
+    </w:p>
+    <w:p>
+      <w:pPr>
+        <w:spacing w:after="0" w:before="0"/>
+      </w:pPr>
+      <w:r>
+        <w:rPr>
+          <w:rFonts w:ascii="Courier New" w:hAnsi="Courier New"/>
+          <w:sz w:val="18"/>
+        </w:rPr>
+        <w:t xml:space="preserve">        // the model has seen, so the left-over probability goes to SAFE.</w:t>
+      </w:r>
+    </w:p>
+    <w:p>
+      <w:pPr>
+        <w:spacing w:after="0" w:before="0"/>
+      </w:pPr>
+      <w:r>
+        <w:rPr>
+          <w:rFonts w:ascii="Courier New" w:hAnsi="Courier New"/>
+          <w:sz w:val="18"/>
+        </w:rPr>
+        <w:t xml:space="preserve">        int safe = Category.SAFE.ordinal();</w:t>
+      </w:r>
+    </w:p>
+    <w:p>
+      <w:pPr>
+        <w:spacing w:after="0" w:before="0"/>
+      </w:pPr>
+      <w:r>
+        <w:rPr>
+          <w:rFonts w:ascii="Courier New" w:hAnsi="Courier New"/>
+          <w:sz w:val="18"/>
+        </w:rPr>
+        <w:t xml:space="preserve">        if (sum &lt; 1.0) {</w:t>
+      </w:r>
+    </w:p>
+    <w:p>
+      <w:pPr>
+        <w:spacing w:after="0" w:before="0"/>
+      </w:pPr>
+      <w:r>
+        <w:rPr>
+          <w:rFonts w:ascii="Courier New" w:hAnsi="Courier New"/>
+          <w:sz w:val="18"/>
+        </w:rPr>
+        <w:t xml:space="preserve">            p[safe] += 1.0 - sum;</w:t>
+      </w:r>
+    </w:p>
+    <w:p>
+      <w:pPr>
+        <w:spacing w:after="0" w:before="0"/>
+      </w:pPr>
+      <w:r>
+        <w:rPr>
+          <w:rFonts w:ascii="Courier New" w:hAnsi="Courier New"/>
+          <w:sz w:val="18"/>
+        </w:rPr>
+        <w:t xml:space="preserve">            sum = 1.0;</w:t>
       </w:r>
     </w:p>
     <w:p>
@@ -8624,7 +8875,7 @@
           <w:rFonts w:ascii="Courier New" w:hAnsi="Courier New"/>
           <w:sz w:val="18"/>
         </w:rPr>
-        <w:t xml:space="preserve">                            @Value("${speaksafe.warn-threshold:40}") int warnThreshold,</w:t>
+        <w:t xml:space="preserve">                            @Value("${speaksafe.warn-threshold:50}") int warnThreshold,</w:t>
       </w:r>
     </w:p>
     <w:p>
@@ -8825,6 +9076,30 @@
           <w:rFonts w:ascii="Courier New" w:hAnsi="Courier New"/>
           <w:sz w:val="18"/>
         </w:rPr>
+        <w:t xml:space="preserve">        // Below the warning threshold the message is SAFE.</w:t>
+      </w:r>
+    </w:p>
+    <w:p>
+      <w:pPr>
+        <w:spacing w:after="0" w:before="0"/>
+      </w:pPr>
+      <w:r>
+        <w:rPr>
+          <w:rFonts w:ascii="Courier New" w:hAnsi="Courier New"/>
+          <w:sz w:val="18"/>
+        </w:rPr>
+        <w:t xml:space="preserve">        // Otherwise it gets the most likely toxic category (insult, threat or hate speech).</w:t>
+      </w:r>
+    </w:p>
+    <w:p>
+      <w:pPr>
+        <w:spacing w:after="0" w:before="0"/>
+      </w:pPr>
+      <w:r>
+        <w:rPr>
+          <w:rFonts w:ascii="Courier New" w:hAnsi="Courier New"/>
+          <w:sz w:val="18"/>
+        </w:rPr>
         <w:t xml:space="preserve">        Category category = Category.SAFE;</w:t>
       </w:r>
     </w:p>
@@ -8837,55 +9112,91 @@
           <w:rFonts w:ascii="Courier New" w:hAnsi="Courier New"/>
           <w:sz w:val="18"/>
         </w:rPr>
-        <w:t xml:space="preserve">        for (Map.Entry&lt;Category, Double&gt; e : probabilities.entrySet()) {</w:t>
-      </w:r>
-    </w:p>
-    <w:p>
-      <w:pPr>
-        <w:spacing w:after="0" w:before="0"/>
-      </w:pPr>
-      <w:r>
-        <w:rPr>
-          <w:rFonts w:ascii="Courier New" w:hAnsi="Courier New"/>
-          <w:sz w:val="18"/>
-        </w:rPr>
-        <w:t xml:space="preserve">            if (e.getValue() &gt; probabilities.get(category)) category = e.getKey();</w:t>
-      </w:r>
-    </w:p>
-    <w:p>
-      <w:pPr>
-        <w:spacing w:after="0" w:before="0"/>
-      </w:pPr>
-      <w:r>
-        <w:rPr>
-          <w:rFonts w:ascii="Courier New" w:hAnsi="Courier New"/>
-          <w:sz w:val="18"/>
-        </w:rPr>
-        <w:t xml:space="preserve">        }</w:t>
-      </w:r>
-    </w:p>
-    <w:p>
-      <w:pPr>
-        <w:spacing w:after="0" w:before="0"/>
-      </w:pPr>
-      <w:r>
-        <w:rPr>
-          <w:rFonts w:ascii="Courier New" w:hAnsi="Courier New"/>
-          <w:sz w:val="18"/>
-        </w:rPr>
-        <w:t xml:space="preserve">        if (score &lt; warnThreshold) {</w:t>
-      </w:r>
-    </w:p>
-    <w:p>
-      <w:pPr>
-        <w:spacing w:after="0" w:before="0"/>
-      </w:pPr>
-      <w:r>
-        <w:rPr>
-          <w:rFonts w:ascii="Courier New" w:hAnsi="Courier New"/>
-          <w:sz w:val="18"/>
-        </w:rPr>
-        <w:t xml:space="preserve">            category = Category.SAFE;</w:t>
+        <w:t xml:space="preserve">        if (score &gt;= warnThreshold) {</w:t>
+      </w:r>
+    </w:p>
+    <w:p>
+      <w:pPr>
+        <w:spacing w:after="0" w:before="0"/>
+      </w:pPr>
+      <w:r>
+        <w:rPr>
+          <w:rFonts w:ascii="Courier New" w:hAnsi="Courier New"/>
+          <w:sz w:val="18"/>
+        </w:rPr>
+        <w:t xml:space="preserve">            double best = -1;</w:t>
+      </w:r>
+    </w:p>
+    <w:p>
+      <w:pPr>
+        <w:spacing w:after="0" w:before="0"/>
+      </w:pPr>
+      <w:r>
+        <w:rPr>
+          <w:rFonts w:ascii="Courier New" w:hAnsi="Courier New"/>
+          <w:sz w:val="18"/>
+        </w:rPr>
+        <w:t xml:space="preserve">            for (Map.Entry&lt;Category, Double&gt; e : probabilities.entrySet()) {</w:t>
+      </w:r>
+    </w:p>
+    <w:p>
+      <w:pPr>
+        <w:spacing w:after="0" w:before="0"/>
+      </w:pPr>
+      <w:r>
+        <w:rPr>
+          <w:rFonts w:ascii="Courier New" w:hAnsi="Courier New"/>
+          <w:sz w:val="18"/>
+        </w:rPr>
+        <w:t xml:space="preserve">                if (e.getKey() != Category.SAFE &amp;&amp; e.getValue() &gt; best) {</w:t>
+      </w:r>
+    </w:p>
+    <w:p>
+      <w:pPr>
+        <w:spacing w:after="0" w:before="0"/>
+      </w:pPr>
+      <w:r>
+        <w:rPr>
+          <w:rFonts w:ascii="Courier New" w:hAnsi="Courier New"/>
+          <w:sz w:val="18"/>
+        </w:rPr>
+        <w:t xml:space="preserve">                    best = e.getValue();</w:t>
+      </w:r>
+    </w:p>
+    <w:p>
+      <w:pPr>
+        <w:spacing w:after="0" w:before="0"/>
+      </w:pPr>
+      <w:r>
+        <w:rPr>
+          <w:rFonts w:ascii="Courier New" w:hAnsi="Courier New"/>
+          <w:sz w:val="18"/>
+        </w:rPr>
+        <w:t xml:space="preserve">                    category = e.getKey();</w:t>
+      </w:r>
+    </w:p>
+    <w:p>
+      <w:pPr>
+        <w:spacing w:after="0" w:before="0"/>
+      </w:pPr>
+      <w:r>
+        <w:rPr>
+          <w:rFonts w:ascii="Courier New" w:hAnsi="Courier New"/>
+          <w:sz w:val="18"/>
+        </w:rPr>
+        <w:t xml:space="preserve">                }</w:t>
+      </w:r>
+    </w:p>
+    <w:p>
+      <w:pPr>
+        <w:spacing w:after="0" w:before="0"/>
+      </w:pPr>
+      <w:r>
+        <w:rPr>
+          <w:rFonts w:ascii="Courier New" w:hAnsi="Courier New"/>
+          <w:sz w:val="18"/>
+        </w:rPr>
+        <w:t xml:space="preserve">            }</w:t>
       </w:r>
     </w:p>
     <w:p>
@@ -11962,7 +12273,7 @@
           <w:rFonts w:ascii="Courier New" w:hAnsi="Courier New"/>
           <w:sz w:val="18"/>
         </w:rPr>
-        <w:t>speaksafe.warn-threshold=40</w:t>
+        <w:t>speaksafe.warn-threshold=50</w:t>
       </w:r>
     </w:p>
     <w:p>
@@ -13947,6 +14258,18 @@
           <w:rFonts w:ascii="Courier New" w:hAnsi="Courier New"/>
           <w:sz w:val="18"/>
         </w:rPr>
+        <w:t xml:space="preserve">    document.body.appendChild(bubble);</w:t>
+      </w:r>
+    </w:p>
+    <w:p>
+      <w:pPr>
+        <w:spacing w:after="0" w:before="0"/>
+      </w:pPr>
+      <w:r>
+        <w:rPr>
+          <w:rFonts w:ascii="Courier New" w:hAnsi="Courier New"/>
+          <w:sz w:val="18"/>
+        </w:rPr>
         <w:t xml:space="preserve">    const box = target.getBoundingClientRect();</w:t>
       </w:r>
     </w:p>
@@ -13971,19 +14294,43 @@
           <w:rFonts w:ascii="Courier New" w:hAnsi="Courier New"/>
           <w:sz w:val="18"/>
         </w:rPr>
-        <w:t xml:space="preserve">    bubble.style.top = (window.scrollY + box.bottom + 6) + 'px';</w:t>
-      </w:r>
-    </w:p>
-    <w:p>
-      <w:pPr>
-        <w:spacing w:after="0" w:before="0"/>
-      </w:pPr>
-      <w:r>
-        <w:rPr>
-          <w:rFonts w:ascii="Courier New" w:hAnsi="Courier New"/>
-          <w:sz w:val="18"/>
-        </w:rPr>
-        <w:t xml:space="preserve">    document.body.appendChild(bubble);</w:t>
+        <w:t xml:space="preserve">    // Show the bubble below the text box, or above it if there is no room below (e.g. chat apps).</w:t>
+      </w:r>
+    </w:p>
+    <w:p>
+      <w:pPr>
+        <w:spacing w:after="0" w:before="0"/>
+      </w:pPr>
+      <w:r>
+        <w:rPr>
+          <w:rFonts w:ascii="Courier New" w:hAnsi="Courier New"/>
+          <w:sz w:val="18"/>
+        </w:rPr>
+        <w:t xml:space="preserve">    const fitsBelow = box.bottom + 6 + bubble.offsetHeight &lt;= window.innerHeight;</w:t>
+      </w:r>
+    </w:p>
+    <w:p>
+      <w:pPr>
+        <w:spacing w:after="0" w:before="0"/>
+      </w:pPr>
+      <w:r>
+        <w:rPr>
+          <w:rFonts w:ascii="Courier New" w:hAnsi="Courier New"/>
+          <w:sz w:val="18"/>
+        </w:rPr>
+        <w:t xml:space="preserve">    const top = fitsBelow ? box.bottom + 6 : box.top - 6 - bubble.offsetHeight;</w:t>
+      </w:r>
+    </w:p>
+    <w:p>
+      <w:pPr>
+        <w:spacing w:after="0" w:before="0"/>
+      </w:pPr>
+      <w:r>
+        <w:rPr>
+          <w:rFonts w:ascii="Courier New" w:hAnsi="Courier New"/>
+          <w:sz w:val="18"/>
+        </w:rPr>
+        <w:t xml:space="preserve">    bubble.style.top = (window.scrollY + top) + 'px';</w:t>
       </w:r>
     </w:p>
     <w:p>
@@ -20143,7 +20490,7 @@
           <w:rFonts w:ascii="Courier New" w:hAnsi="Courier New"/>
           <w:sz w:val="18"/>
         </w:rPr>
-        <w:t>Dataset size: 780 messages (80% train / 20% test)</w:t>
+        <w:t>Dataset size: 1160 messages (80% train / 20% test)</w:t>
       </w:r>
     </w:p>
     <w:p>
@@ -20178,19 +20525,19 @@
           <w:rFonts w:ascii="Courier New" w:hAnsi="Courier New"/>
           <w:sz w:val="18"/>
         </w:rPr>
-        <w:t>Naive Bayes        97.4%      96.8%    98.0%     97.3%        0.082</w:t>
-      </w:r>
-    </w:p>
-    <w:p>
-      <w:pPr>
-        <w:spacing w:after="0" w:before="0"/>
-      </w:pPr>
-      <w:r>
-        <w:rPr>
-          <w:rFonts w:ascii="Courier New" w:hAnsi="Courier New"/>
-          <w:sz w:val="18"/>
-        </w:rPr>
-        <w:t>Linear SVM         99.4%      99.1%    99.6%     99.4%        0.074</w:t>
+        <w:t>Naive Bayes        97.4%      96.8%    96.2%     96.5%        0.086</w:t>
+      </w:r>
+    </w:p>
+    <w:p>
+      <w:pPr>
+        <w:spacing w:after="0" w:before="0"/>
+      </w:pPr>
+      <w:r>
+        <w:rPr>
+          <w:rFonts w:ascii="Courier New" w:hAnsi="Courier New"/>
+          <w:sz w:val="18"/>
+        </w:rPr>
+        <w:t>Linear SVM         99.1%      98.9%    98.3%     98.6%        0.031</w:t>
       </w:r>
     </w:p>
     <w:p>
@@ -20237,43 +20584,43 @@
           <w:rFonts w:ascii="Courier New" w:hAnsi="Courier New"/>
           <w:sz w:val="18"/>
         </w:rPr>
-        <w:t>SAFE             100.0%    95.6%     97.7%       68</w:t>
-      </w:r>
-    </w:p>
-    <w:p>
-      <w:pPr>
-        <w:spacing w:after="0" w:before="0"/>
-      </w:pPr>
-      <w:r>
-        <w:rPr>
-          <w:rFonts w:ascii="Courier New" w:hAnsi="Courier New"/>
-          <w:sz w:val="18"/>
-        </w:rPr>
-        <w:t>INSULT            97.0%   100.0%     98.5%       32</w:t>
-      </w:r>
-    </w:p>
-    <w:p>
-      <w:pPr>
-        <w:spacing w:after="0" w:before="0"/>
-      </w:pPr>
-      <w:r>
-        <w:rPr>
-          <w:rFonts w:ascii="Courier New" w:hAnsi="Courier New"/>
-          <w:sz w:val="18"/>
-        </w:rPr>
-        <w:t>THREAT            90.3%   100.0%     94.9%       28</w:t>
-      </w:r>
-    </w:p>
-    <w:p>
-      <w:pPr>
-        <w:spacing w:after="0" w:before="0"/>
-      </w:pPr>
-      <w:r>
-        <w:rPr>
-          <w:rFonts w:ascii="Courier New" w:hAnsi="Courier New"/>
-          <w:sz w:val="18"/>
-        </w:rPr>
-        <w:t>HATE_SPEECH      100.0%    96.4%     98.2%       28</w:t>
+        <w:t>SAFE              97.9%    98.6%     98.3%      144</w:t>
+      </w:r>
+    </w:p>
+    <w:p>
+      <w:pPr>
+        <w:spacing w:after="0" w:before="0"/>
+      </w:pPr>
+      <w:r>
+        <w:rPr>
+          <w:rFonts w:ascii="Courier New" w:hAnsi="Courier New"/>
+          <w:sz w:val="18"/>
+        </w:rPr>
+        <w:t>INSULT           100.0%    96.9%     98.4%       32</w:t>
+      </w:r>
+    </w:p>
+    <w:p>
+      <w:pPr>
+        <w:spacing w:after="0" w:before="0"/>
+      </w:pPr>
+      <w:r>
+        <w:rPr>
+          <w:rFonts w:ascii="Courier New" w:hAnsi="Courier New"/>
+          <w:sz w:val="18"/>
+        </w:rPr>
+        <w:t>THREAT            92.6%    89.3%     90.9%       28</w:t>
+      </w:r>
+    </w:p>
+    <w:p>
+      <w:pPr>
+        <w:spacing w:after="0" w:before="0"/>
+      </w:pPr>
+      <w:r>
+        <w:rPr>
+          <w:rFonts w:ascii="Courier New" w:hAnsi="Courier New"/>
+          <w:sz w:val="18"/>
+        </w:rPr>
+        <w:t>HATE_SPEECH       96.6%   100.0%     98.2%       28</w:t>
       </w:r>
     </w:p>
     <w:p>
@@ -20309,43 +20656,43 @@
           <w:rFonts w:ascii="Courier New" w:hAnsi="Courier New"/>
           <w:sz w:val="18"/>
         </w:rPr>
-        <w:t>SAFE                  65           0           3           0</w:t>
-      </w:r>
-    </w:p>
-    <w:p>
-      <w:pPr>
-        <w:spacing w:after="0" w:before="0"/>
-      </w:pPr>
-      <w:r>
-        <w:rPr>
-          <w:rFonts w:ascii="Courier New" w:hAnsi="Courier New"/>
-          <w:sz w:val="18"/>
-        </w:rPr>
-        <w:t>INSULT                 0          32           0           0</w:t>
-      </w:r>
-    </w:p>
-    <w:p>
-      <w:pPr>
-        <w:spacing w:after="0" w:before="0"/>
-      </w:pPr>
-      <w:r>
-        <w:rPr>
-          <w:rFonts w:ascii="Courier New" w:hAnsi="Courier New"/>
-          <w:sz w:val="18"/>
-        </w:rPr>
-        <w:t>THREAT                 0           0          28           0</w:t>
-      </w:r>
-    </w:p>
-    <w:p>
-      <w:pPr>
-        <w:spacing w:after="0" w:before="0"/>
-      </w:pPr>
-      <w:r>
-        <w:rPr>
-          <w:rFonts w:ascii="Courier New" w:hAnsi="Courier New"/>
-          <w:sz w:val="18"/>
-        </w:rPr>
-        <w:t>HATE_SPEECH            0           1           0          27</w:t>
+        <w:t>SAFE                 142           0           1           1</w:t>
+      </w:r>
+    </w:p>
+    <w:p>
+      <w:pPr>
+        <w:spacing w:after="0" w:before="0"/>
+      </w:pPr>
+      <w:r>
+        <w:rPr>
+          <w:rFonts w:ascii="Courier New" w:hAnsi="Courier New"/>
+          <w:sz w:val="18"/>
+        </w:rPr>
+        <w:t>INSULT                 0          31           1           0</w:t>
+      </w:r>
+    </w:p>
+    <w:p>
+      <w:pPr>
+        <w:spacing w:after="0" w:before="0"/>
+      </w:pPr>
+      <w:r>
+        <w:rPr>
+          <w:rFonts w:ascii="Courier New" w:hAnsi="Courier New"/>
+          <w:sz w:val="18"/>
+        </w:rPr>
+        <w:t>THREAT                 3           0          25           0</w:t>
+      </w:r>
+    </w:p>
+    <w:p>
+      <w:pPr>
+        <w:spacing w:after="0" w:before="0"/>
+      </w:pPr>
+      <w:r>
+        <w:rPr>
+          <w:rFonts w:ascii="Courier New" w:hAnsi="Courier New"/>
+          <w:sz w:val="18"/>
+        </w:rPr>
+        <w:t>HATE_SPEECH            0           0           0          28</w:t>
       </w:r>
     </w:p>
     <w:p>
@@ -20392,31 +20739,31 @@
           <w:rFonts w:ascii="Courier New" w:hAnsi="Courier New"/>
           <w:sz w:val="18"/>
         </w:rPr>
-        <w:t>SAFE             100.0%    98.5%     99.3%       68</w:t>
-      </w:r>
-    </w:p>
-    <w:p>
-      <w:pPr>
-        <w:spacing w:after="0" w:before="0"/>
-      </w:pPr>
-      <w:r>
-        <w:rPr>
-          <w:rFonts w:ascii="Courier New" w:hAnsi="Courier New"/>
-          <w:sz w:val="18"/>
-        </w:rPr>
-        <w:t>INSULT           100.0%   100.0%    100.0%       32</w:t>
-      </w:r>
-    </w:p>
-    <w:p>
-      <w:pPr>
-        <w:spacing w:after="0" w:before="0"/>
-      </w:pPr>
-      <w:r>
-        <w:rPr>
-          <w:rFonts w:ascii="Courier New" w:hAnsi="Courier New"/>
-          <w:sz w:val="18"/>
-        </w:rPr>
-        <w:t>THREAT            96.6%   100.0%     98.2%       28</w:t>
+        <w:t>SAFE              99.3%   100.0%     99.7%      144</w:t>
+      </w:r>
+    </w:p>
+    <w:p>
+      <w:pPr>
+        <w:spacing w:after="0" w:before="0"/>
+      </w:pPr>
+      <w:r>
+        <w:rPr>
+          <w:rFonts w:ascii="Courier New" w:hAnsi="Courier New"/>
+          <w:sz w:val="18"/>
+        </w:rPr>
+        <w:t>INSULT           100.0%    96.9%     98.4%       32</w:t>
+      </w:r>
+    </w:p>
+    <w:p>
+      <w:pPr>
+        <w:spacing w:after="0" w:before="0"/>
+      </w:pPr>
+      <w:r>
+        <w:rPr>
+          <w:rFonts w:ascii="Courier New" w:hAnsi="Courier New"/>
+          <w:sz w:val="18"/>
+        </w:rPr>
+        <w:t>THREAT            96.4%    96.4%     96.4%       28</w:t>
       </w:r>
     </w:p>
     <w:p>
@@ -20464,31 +20811,31 @@
           <w:rFonts w:ascii="Courier New" w:hAnsi="Courier New"/>
           <w:sz w:val="18"/>
         </w:rPr>
-        <w:t>SAFE                  67           0           1           0</w:t>
-      </w:r>
-    </w:p>
-    <w:p>
-      <w:pPr>
-        <w:spacing w:after="0" w:before="0"/>
-      </w:pPr>
-      <w:r>
-        <w:rPr>
-          <w:rFonts w:ascii="Courier New" w:hAnsi="Courier New"/>
-          <w:sz w:val="18"/>
-        </w:rPr>
-        <w:t>INSULT                 0          32           0           0</w:t>
-      </w:r>
-    </w:p>
-    <w:p>
-      <w:pPr>
-        <w:spacing w:after="0" w:before="0"/>
-      </w:pPr>
-      <w:r>
-        <w:rPr>
-          <w:rFonts w:ascii="Courier New" w:hAnsi="Courier New"/>
-          <w:sz w:val="18"/>
-        </w:rPr>
-        <w:t>THREAT                 0           0          28           0</w:t>
+        <w:t>SAFE                 144           0           0           0</w:t>
+      </w:r>
+    </w:p>
+    <w:p>
+      <w:pPr>
+        <w:spacing w:after="0" w:before="0"/>
+      </w:pPr>
+      <w:r>
+        <w:rPr>
+          <w:rFonts w:ascii="Courier New" w:hAnsi="Courier New"/>
+          <w:sz w:val="18"/>
+        </w:rPr>
+        <w:t>INSULT                 0          31           1           0</w:t>
+      </w:r>
+    </w:p>
+    <w:p>
+      <w:pPr>
+        <w:spacing w:after="0" w:before="0"/>
+      </w:pPr>
+      <w:r>
+        <w:rPr>
+          <w:rFonts w:ascii="Courier New" w:hAnsi="Courier New"/>
+          <w:sz w:val="18"/>
+        </w:rPr>
+        <w:t>THREAT                 1           0          27           0</w:t>
       </w:r>
     </w:p>
     <w:p>
@@ -20523,7 +20870,7 @@
       <w:r>
         <w:drawing>
           <wp:inline xmlns:a="http://schemas.openxmlformats.org/drawingml/2006/main" xmlns:pic="http://schemas.openxmlformats.org/drawingml/2006/picture">
-            <wp:extent cx="5029200" cy="5762270"/>
+            <wp:extent cx="5029200" cy="3861128"/>
             <wp:docPr id="1" name="Picture 1"/>
             <wp:cNvGraphicFramePr>
               <a:graphicFrameLocks noChangeAspect="1"/>
@@ -20544,7 +20891,7 @@
                   <pic:spPr>
                     <a:xfrm>
                       <a:off x="0" y="0"/>
-                      <a:ext cx="5029200" cy="5762270"/>
+                      <a:ext cx="5029200" cy="3861128"/>
                     </a:xfrm>
                     <a:prstGeom prst="rect"/>
                   </pic:spPr>
@@ -20560,7 +20907,7 @@
         <w:jc w:val="center"/>
       </w:pPr>
       <w:r>
-        <w:t>Fig A.1  Browser extension blurring toxic comments and warning while typing</w:t>
+        <w:t>Fig A.1  Browser extension blurring toxic messages in a group chat and warning while typing</w:t>
       </w:r>
     </w:p>
     <w:p/>
@@ -20619,7 +20966,7 @@
       <w:r>
         <w:drawing>
           <wp:inline xmlns:a="http://schemas.openxmlformats.org/drawingml/2006/main" xmlns:pic="http://schemas.openxmlformats.org/drawingml/2006/picture">
-            <wp:extent cx="5029200" cy="5029200"/>
+            <wp:extent cx="5029200" cy="3842587"/>
             <wp:docPr id="3" name="Picture 3"/>
             <wp:cNvGraphicFramePr>
               <a:graphicFrameLocks noChangeAspect="1"/>
@@ -20640,7 +20987,7 @@
                   <pic:spPr>
                     <a:xfrm>
                       <a:off x="0" y="0"/>
-                      <a:ext cx="5029200" cy="5029200"/>
+                      <a:ext cx="5029200" cy="3842587"/>
                     </a:xfrm>
                     <a:prstGeom prst="rect"/>
                   </pic:spPr>
@@ -20667,7 +21014,7 @@
       <w:r>
         <w:drawing>
           <wp:inline xmlns:a="http://schemas.openxmlformats.org/drawingml/2006/main" xmlns:pic="http://schemas.openxmlformats.org/drawingml/2006/picture">
-            <wp:extent cx="5029200" cy="5557692"/>
+            <wp:extent cx="5029200" cy="5006024"/>
             <wp:docPr id="4" name="Picture 4"/>
             <wp:cNvGraphicFramePr>
               <a:graphicFrameLocks noChangeAspect="1"/>
@@ -20688,7 +21035,7 @@
                   <pic:spPr>
                     <a:xfrm>
                       <a:off x="0" y="0"/>
-                      <a:ext cx="5029200" cy="5557692"/>
+                      <a:ext cx="5029200" cy="5006024"/>
                     </a:xfrm>
                     <a:prstGeom prst="rect"/>
                   </pic:spPr>

</xml_diff>

<commit_message>
Make dataset generation reproducible and refresh results
- make_dataset.py sorts generated sentences so every run writes the same file
- Regenerated dataset (same 1160 messages, fixed order), evaluation output,
  unseen-sentence test (SVM vs Naive Bayes) and appendix

Co-Authored-By: Claude Opus 5.5 <noreply@anthropic.com>
Claude-Session: https://claude.ai/code/session_01HeWQMV62hmLxWcHtjFuzsM
</commit_message>
<xml_diff>
--- a/docs/SpeakSafe_Appendix.docx
+++ b/docs/SpeakSafe_Appendix.docx
@@ -20525,19 +20525,19 @@
           <w:rFonts w:ascii="Courier New" w:hAnsi="Courier New"/>
           <w:sz w:val="18"/>
         </w:rPr>
-        <w:t>Naive Bayes        97.4%      96.8%    96.2%     96.5%        0.086</w:t>
-      </w:r>
-    </w:p>
-    <w:p>
-      <w:pPr>
-        <w:spacing w:after="0" w:before="0"/>
-      </w:pPr>
-      <w:r>
-        <w:rPr>
-          <w:rFonts w:ascii="Courier New" w:hAnsi="Courier New"/>
-          <w:sz w:val="18"/>
-        </w:rPr>
-        <w:t>Linear SVM         99.1%      98.9%    98.3%     98.6%        0.031</w:t>
+        <w:t>Naive Bayes        98.7%      98.9%    97.3%     98.1%        0.096</w:t>
+      </w:r>
+    </w:p>
+    <w:p>
+      <w:pPr>
+        <w:spacing w:after="0" w:before="0"/>
+      </w:pPr>
+      <w:r>
+        <w:rPr>
+          <w:rFonts w:ascii="Courier New" w:hAnsi="Courier New"/>
+          <w:sz w:val="18"/>
+        </w:rPr>
+        <w:t>Linear SVM         95.7%      97.7%    91.5%     94.3%        0.038</w:t>
       </w:r>
     </w:p>
     <w:p>
@@ -20584,43 +20584,43 @@
           <w:rFonts w:ascii="Courier New" w:hAnsi="Courier New"/>
           <w:sz w:val="18"/>
         </w:rPr>
-        <w:t>SAFE              97.9%    98.6%     98.3%      144</w:t>
-      </w:r>
-    </w:p>
-    <w:p>
-      <w:pPr>
-        <w:spacing w:after="0" w:before="0"/>
-      </w:pPr>
-      <w:r>
-        <w:rPr>
-          <w:rFonts w:ascii="Courier New" w:hAnsi="Courier New"/>
-          <w:sz w:val="18"/>
-        </w:rPr>
-        <w:t>INSULT           100.0%    96.9%     98.4%       32</w:t>
-      </w:r>
-    </w:p>
-    <w:p>
-      <w:pPr>
-        <w:spacing w:after="0" w:before="0"/>
-      </w:pPr>
-      <w:r>
-        <w:rPr>
-          <w:rFonts w:ascii="Courier New" w:hAnsi="Courier New"/>
-          <w:sz w:val="18"/>
-        </w:rPr>
-        <w:t>THREAT            92.6%    89.3%     90.9%       28</w:t>
-      </w:r>
-    </w:p>
-    <w:p>
-      <w:pPr>
-        <w:spacing w:after="0" w:before="0"/>
-      </w:pPr>
-      <w:r>
-        <w:rPr>
-          <w:rFonts w:ascii="Courier New" w:hAnsi="Courier New"/>
-          <w:sz w:val="18"/>
-        </w:rPr>
-        <w:t>HATE_SPEECH       96.6%   100.0%     98.2%       28</w:t>
+        <w:t>SAFE              98.6%   100.0%     99.3%      144</w:t>
+      </w:r>
+    </w:p>
+    <w:p>
+      <w:pPr>
+        <w:spacing w:after="0" w:before="0"/>
+      </w:pPr>
+      <w:r>
+        <w:rPr>
+          <w:rFonts w:ascii="Courier New" w:hAnsi="Courier New"/>
+          <w:sz w:val="18"/>
+        </w:rPr>
+        <w:t>INSULT            97.0%   100.0%     98.5%       32</w:t>
+      </w:r>
+    </w:p>
+    <w:p>
+      <w:pPr>
+        <w:spacing w:after="0" w:before="0"/>
+      </w:pPr>
+      <w:r>
+        <w:rPr>
+          <w:rFonts w:ascii="Courier New" w:hAnsi="Courier New"/>
+          <w:sz w:val="18"/>
+        </w:rPr>
+        <w:t>THREAT           100.0%    92.9%     96.3%       28</w:t>
+      </w:r>
+    </w:p>
+    <w:p>
+      <w:pPr>
+        <w:spacing w:after="0" w:before="0"/>
+      </w:pPr>
+      <w:r>
+        <w:rPr>
+          <w:rFonts w:ascii="Courier New" w:hAnsi="Courier New"/>
+          <w:sz w:val="18"/>
+        </w:rPr>
+        <w:t>HATE_SPEECH      100.0%    96.4%     98.2%       28</w:t>
       </w:r>
     </w:p>
     <w:p>
@@ -20656,43 +20656,43 @@
           <w:rFonts w:ascii="Courier New" w:hAnsi="Courier New"/>
           <w:sz w:val="18"/>
         </w:rPr>
-        <w:t>SAFE                 142           0           1           1</w:t>
-      </w:r>
-    </w:p>
-    <w:p>
-      <w:pPr>
-        <w:spacing w:after="0" w:before="0"/>
-      </w:pPr>
-      <w:r>
-        <w:rPr>
-          <w:rFonts w:ascii="Courier New" w:hAnsi="Courier New"/>
-          <w:sz w:val="18"/>
-        </w:rPr>
-        <w:t>INSULT                 0          31           1           0</w:t>
-      </w:r>
-    </w:p>
-    <w:p>
-      <w:pPr>
-        <w:spacing w:after="0" w:before="0"/>
-      </w:pPr>
-      <w:r>
-        <w:rPr>
-          <w:rFonts w:ascii="Courier New" w:hAnsi="Courier New"/>
-          <w:sz w:val="18"/>
-        </w:rPr>
-        <w:t>THREAT                 3           0          25           0</w:t>
-      </w:r>
-    </w:p>
-    <w:p>
-      <w:pPr>
-        <w:spacing w:after="0" w:before="0"/>
-      </w:pPr>
-      <w:r>
-        <w:rPr>
-          <w:rFonts w:ascii="Courier New" w:hAnsi="Courier New"/>
-          <w:sz w:val="18"/>
-        </w:rPr>
-        <w:t>HATE_SPEECH            0           0           0          28</w:t>
+        <w:t>SAFE                 144           0           0           0</w:t>
+      </w:r>
+    </w:p>
+    <w:p>
+      <w:pPr>
+        <w:spacing w:after="0" w:before="0"/>
+      </w:pPr>
+      <w:r>
+        <w:rPr>
+          <w:rFonts w:ascii="Courier New" w:hAnsi="Courier New"/>
+          <w:sz w:val="18"/>
+        </w:rPr>
+        <w:t>INSULT                 0          32           0           0</w:t>
+      </w:r>
+    </w:p>
+    <w:p>
+      <w:pPr>
+        <w:spacing w:after="0" w:before="0"/>
+      </w:pPr>
+      <w:r>
+        <w:rPr>
+          <w:rFonts w:ascii="Courier New" w:hAnsi="Courier New"/>
+          <w:sz w:val="18"/>
+        </w:rPr>
+        <w:t>THREAT                 1           1          26           0</w:t>
+      </w:r>
+    </w:p>
+    <w:p>
+      <w:pPr>
+        <w:spacing w:after="0" w:before="0"/>
+      </w:pPr>
+      <w:r>
+        <w:rPr>
+          <w:rFonts w:ascii="Courier New" w:hAnsi="Courier New"/>
+          <w:sz w:val="18"/>
+        </w:rPr>
+        <w:t>HATE_SPEECH            1           0           0          27</w:t>
       </w:r>
     </w:p>
     <w:p>
@@ -20739,43 +20739,43 @@
           <w:rFonts w:ascii="Courier New" w:hAnsi="Courier New"/>
           <w:sz w:val="18"/>
         </w:rPr>
-        <w:t>SAFE              99.3%   100.0%     99.7%      144</w:t>
-      </w:r>
-    </w:p>
-    <w:p>
-      <w:pPr>
-        <w:spacing w:after="0" w:before="0"/>
-      </w:pPr>
-      <w:r>
-        <w:rPr>
-          <w:rFonts w:ascii="Courier New" w:hAnsi="Courier New"/>
-          <w:sz w:val="18"/>
-        </w:rPr>
-        <w:t>INSULT           100.0%    96.9%     98.4%       32</w:t>
-      </w:r>
-    </w:p>
-    <w:p>
-      <w:pPr>
-        <w:spacing w:after="0" w:before="0"/>
-      </w:pPr>
-      <w:r>
-        <w:rPr>
-          <w:rFonts w:ascii="Courier New" w:hAnsi="Courier New"/>
-          <w:sz w:val="18"/>
-        </w:rPr>
-        <w:t>THREAT            96.4%    96.4%     96.4%       28</w:t>
-      </w:r>
-    </w:p>
-    <w:p>
-      <w:pPr>
-        <w:spacing w:after="0" w:before="0"/>
-      </w:pPr>
-      <w:r>
-        <w:rPr>
-          <w:rFonts w:ascii="Courier New" w:hAnsi="Courier New"/>
-          <w:sz w:val="18"/>
-        </w:rPr>
-        <w:t>HATE_SPEECH      100.0%   100.0%    100.0%       28</w:t>
+        <w:t>SAFE              94.1%   100.0%     97.0%      144</w:t>
+      </w:r>
+    </w:p>
+    <w:p>
+      <w:pPr>
+        <w:spacing w:after="0" w:before="0"/>
+      </w:pPr>
+      <w:r>
+        <w:rPr>
+          <w:rFonts w:ascii="Courier New" w:hAnsi="Courier New"/>
+          <w:sz w:val="18"/>
+        </w:rPr>
+        <w:t>INSULT            96.6%    87.5%     91.8%       32</w:t>
+      </w:r>
+    </w:p>
+    <w:p>
+      <w:pPr>
+        <w:spacing w:after="0" w:before="0"/>
+      </w:pPr>
+      <w:r>
+        <w:rPr>
+          <w:rFonts w:ascii="Courier New" w:hAnsi="Courier New"/>
+          <w:sz w:val="18"/>
+        </w:rPr>
+        <w:t>THREAT           100.0%    82.1%     90.2%       28</w:t>
+      </w:r>
+    </w:p>
+    <w:p>
+      <w:pPr>
+        <w:spacing w:after="0" w:before="0"/>
+      </w:pPr>
+      <w:r>
+        <w:rPr>
+          <w:rFonts w:ascii="Courier New" w:hAnsi="Courier New"/>
+          <w:sz w:val="18"/>
+        </w:rPr>
+        <w:t>HATE_SPEECH      100.0%    96.4%     98.2%       28</w:t>
       </w:r>
     </w:p>
     <w:p>
@@ -20823,31 +20823,31 @@
           <w:rFonts w:ascii="Courier New" w:hAnsi="Courier New"/>
           <w:sz w:val="18"/>
         </w:rPr>
-        <w:t>INSULT                 0          31           1           0</w:t>
-      </w:r>
-    </w:p>
-    <w:p>
-      <w:pPr>
-        <w:spacing w:after="0" w:before="0"/>
-      </w:pPr>
-      <w:r>
-        <w:rPr>
-          <w:rFonts w:ascii="Courier New" w:hAnsi="Courier New"/>
-          <w:sz w:val="18"/>
-        </w:rPr>
-        <w:t>THREAT                 1           0          27           0</w:t>
-      </w:r>
-    </w:p>
-    <w:p>
-      <w:pPr>
-        <w:spacing w:after="0" w:before="0"/>
-      </w:pPr>
-      <w:r>
-        <w:rPr>
-          <w:rFonts w:ascii="Courier New" w:hAnsi="Courier New"/>
-          <w:sz w:val="18"/>
-        </w:rPr>
-        <w:t>HATE_SPEECH            0           0           0          28</w:t>
+        <w:t>INSULT                 4          28           0           0</w:t>
+      </w:r>
+    </w:p>
+    <w:p>
+      <w:pPr>
+        <w:spacing w:after="0" w:before="0"/>
+      </w:pPr>
+      <w:r>
+        <w:rPr>
+          <w:rFonts w:ascii="Courier New" w:hAnsi="Courier New"/>
+          <w:sz w:val="18"/>
+        </w:rPr>
+        <w:t>THREAT                 4           1          23           0</w:t>
+      </w:r>
+    </w:p>
+    <w:p>
+      <w:pPr>
+        <w:spacing w:after="0" w:before="0"/>
+      </w:pPr>
+      <w:r>
+        <w:rPr>
+          <w:rFonts w:ascii="Courier New" w:hAnsi="Courier New"/>
+          <w:sz w:val="18"/>
+        </w:rPr>
+        <w:t>HATE_SPEECH            1           0           0          27</w:t>
       </w:r>
     </w:p>
     <w:p>

</xml_diff>

<commit_message>
Detect profanity and masked swear words
- Dataset: directed profanity ('fuck off', 'you piece of shit') labelled as
  insult; mild exclamations ('damn this traffic') labelled safe
- TextPreprocessor: remove * inside words and write masked/short swear
  words in full (f*ck, fck, f**k -> fuck; sh*t -> shit; b*tch -> bitch);
  the same table is exported to model.json for the browser model
- Tests for profanity, masked spellings and mild exclamations
- Java/browser parity re-verified on 2,823 messages
- Refreshed evaluation, unseen-text results, README, extension ZIP,
  appendix and project report

Co-Authored-By: Claude Opus 5.5 <noreply@anthropic.com>
Claude-Session: https://claude.ai/code/session_01HeWQMV62hmLxWcHtjFuzsM
</commit_message>
<xml_diff>
--- a/docs/SpeakSafe_Appendix.docx
+++ b/docs/SpeakSafe_Appendix.docx
@@ -1413,6 +1413,18 @@
           <w:rFonts w:ascii="Courier New" w:hAnsi="Courier New"/>
           <w:sz w:val="18"/>
         </w:rPr>
+        <w:t>import java.util.Map;</w:t>
+      </w:r>
+    </w:p>
+    <w:p>
+      <w:pPr>
+        <w:spacing w:after="0" w:before="0"/>
+      </w:pPr>
+      <w:r>
+        <w:rPr>
+          <w:rFonts w:ascii="Courier New" w:hAnsi="Courier New"/>
+          <w:sz w:val="18"/>
+        </w:rPr>
         <w:t>import java.util.Set;</w:t>
       </w:r>
     </w:p>
@@ -1650,6 +1662,161 @@
           <w:rFonts w:ascii="Courier New" w:hAnsi="Courier New"/>
           <w:sz w:val="18"/>
         </w:rPr>
+        <w:t xml:space="preserve">    // Common disguised or shortened spellings of swear words, written out in full</w:t>
+      </w:r>
+    </w:p>
+    <w:p>
+      <w:pPr>
+        <w:spacing w:after="0" w:before="0"/>
+      </w:pPr>
+      <w:r>
+        <w:rPr>
+          <w:rFonts w:ascii="Courier New" w:hAnsi="Courier New"/>
+          <w:sz w:val="18"/>
+        </w:rPr>
+        <w:t xml:space="preserve">    // so the model recognises them (e.g. "f*ck" -&gt; "fck" -&gt; "fuck").</w:t>
+      </w:r>
+    </w:p>
+    <w:p>
+      <w:pPr>
+        <w:spacing w:after="0" w:before="0"/>
+      </w:pPr>
+      <w:r>
+        <w:rPr>
+          <w:rFonts w:ascii="Courier New" w:hAnsi="Courier New"/>
+          <w:sz w:val="18"/>
+        </w:rPr>
+        <w:t xml:space="preserve">    private static final Map&lt;String, String&gt; SLANG = Map.ofEntries(</w:t>
+      </w:r>
+    </w:p>
+    <w:p>
+      <w:pPr>
+        <w:spacing w:after="0" w:before="0"/>
+      </w:pPr>
+      <w:r>
+        <w:rPr>
+          <w:rFonts w:ascii="Courier New" w:hAnsi="Courier New"/>
+          <w:sz w:val="18"/>
+        </w:rPr>
+        <w:t xml:space="preserve">            Map.entry("fck", "fuck"), Map.entry("fk", "fuck"), Map.entry("fuk", "fuck"),</w:t>
+      </w:r>
+    </w:p>
+    <w:p>
+      <w:pPr>
+        <w:spacing w:after="0" w:before="0"/>
+      </w:pPr>
+      <w:r>
+        <w:rPr>
+          <w:rFonts w:ascii="Courier New" w:hAnsi="Courier New"/>
+          <w:sz w:val="18"/>
+        </w:rPr>
+        <w:t xml:space="preserve">            Map.entry("fuq", "fuck"), Map.entry("fuc", "fuck"), Map.entry("fcuk", "fuck"),</w:t>
+      </w:r>
+    </w:p>
+    <w:p>
+      <w:pPr>
+        <w:spacing w:after="0" w:before="0"/>
+      </w:pPr>
+      <w:r>
+        <w:rPr>
+          <w:rFonts w:ascii="Courier New" w:hAnsi="Courier New"/>
+          <w:sz w:val="18"/>
+        </w:rPr>
+        <w:t xml:space="preserve">            Map.entry("phuck", "fuck"), Map.entry("fking", "fucking"), Map.entry("fcking", "fucking"),</w:t>
+      </w:r>
+    </w:p>
+    <w:p>
+      <w:pPr>
+        <w:spacing w:after="0" w:before="0"/>
+      </w:pPr>
+      <w:r>
+        <w:rPr>
+          <w:rFonts w:ascii="Courier New" w:hAnsi="Courier New"/>
+          <w:sz w:val="18"/>
+        </w:rPr>
+        <w:t xml:space="preserve">            Map.entry("fuking", "fucking"), Map.entry("fkin", "fucking"), Map.entry("fckin", "fucking"),</w:t>
+      </w:r>
+    </w:p>
+    <w:p>
+      <w:pPr>
+        <w:spacing w:after="0" w:before="0"/>
+      </w:pPr>
+      <w:r>
+        <w:rPr>
+          <w:rFonts w:ascii="Courier New" w:hAnsi="Courier New"/>
+          <w:sz w:val="18"/>
+        </w:rPr>
+        <w:t xml:space="preserve">            Map.entry("fkn", "fucking"), Map.entry("fcker", "fucker"), Map.entry("fker", "fucker"),</w:t>
+      </w:r>
+    </w:p>
+    <w:p>
+      <w:pPr>
+        <w:spacing w:after="0" w:before="0"/>
+      </w:pPr>
+      <w:r>
+        <w:rPr>
+          <w:rFonts w:ascii="Courier New" w:hAnsi="Courier New"/>
+          <w:sz w:val="18"/>
+        </w:rPr>
+        <w:t xml:space="preserve">            Map.entry("sht", "shit"), Map.entry("shyt", "shit"), Map.entry("btch", "bitch"),</w:t>
+      </w:r>
+    </w:p>
+    <w:p>
+      <w:pPr>
+        <w:spacing w:after="0" w:before="0"/>
+      </w:pPr>
+      <w:r>
+        <w:rPr>
+          <w:rFonts w:ascii="Courier New" w:hAnsi="Courier New"/>
+          <w:sz w:val="18"/>
+        </w:rPr>
+        <w:t xml:space="preserve">            Map.entry("biatch", "bitch"), Map.entry("bich", "bitch"), Map.entry("ahole", "asshole"),</w:t>
+      </w:r>
+    </w:p>
+    <w:p>
+      <w:pPr>
+        <w:spacing w:after="0" w:before="0"/>
+      </w:pPr>
+      <w:r>
+        <w:rPr>
+          <w:rFonts w:ascii="Courier New" w:hAnsi="Courier New"/>
+          <w:sz w:val="18"/>
+        </w:rPr>
+        <w:t xml:space="preserve">            Map.entry("azzhole", "asshole"), Map.entry("mofo", "motherfucker"), Map.entry("bstrd", "bastard"),</w:t>
+      </w:r>
+    </w:p>
+    <w:p>
+      <w:pPr>
+        <w:spacing w:after="0" w:before="0"/>
+      </w:pPr>
+      <w:r>
+        <w:rPr>
+          <w:rFonts w:ascii="Courier New" w:hAnsi="Courier New"/>
+          <w:sz w:val="18"/>
+        </w:rPr>
+        <w:t xml:space="preserve">            Map.entry("dck", "dick"), Map.entry("idiotic", "idiot"));</w:t>
+      </w:r>
+    </w:p>
+    <w:p>
+      <w:pPr>
+        <w:spacing w:after="0" w:before="0"/>
+      </w:pPr>
+      <w:r>
+        <w:rPr>
+          <w:rFonts w:ascii="Courier New" w:hAnsi="Courier New"/>
+          <w:sz w:val="18"/>
+        </w:rPr>
+      </w:r>
+    </w:p>
+    <w:p>
+      <w:pPr>
+        <w:spacing w:after="0" w:before="0"/>
+      </w:pPr>
+      <w:r>
+        <w:rPr>
+          <w:rFonts w:ascii="Courier New" w:hAnsi="Courier New"/>
+          <w:sz w:val="18"/>
+        </w:rPr>
         <w:t xml:space="preserve">    public static Set&lt;String&gt; stopwords() {</w:t>
       </w:r>
     </w:p>
@@ -1697,6 +1864,53 @@
           <w:rFonts w:ascii="Courier New" w:hAnsi="Courier New"/>
           <w:sz w:val="18"/>
         </w:rPr>
+        <w:t xml:space="preserve">    public static Map&lt;String, String&gt; slang() {</w:t>
+      </w:r>
+    </w:p>
+    <w:p>
+      <w:pPr>
+        <w:spacing w:after="0" w:before="0"/>
+      </w:pPr>
+      <w:r>
+        <w:rPr>
+          <w:rFonts w:ascii="Courier New" w:hAnsi="Courier New"/>
+          <w:sz w:val="18"/>
+        </w:rPr>
+        <w:t xml:space="preserve">        return SLANG;</w:t>
+      </w:r>
+    </w:p>
+    <w:p>
+      <w:pPr>
+        <w:spacing w:after="0" w:before="0"/>
+      </w:pPr>
+      <w:r>
+        <w:rPr>
+          <w:rFonts w:ascii="Courier New" w:hAnsi="Courier New"/>
+          <w:sz w:val="18"/>
+        </w:rPr>
+        <w:t xml:space="preserve">    }</w:t>
+      </w:r>
+    </w:p>
+    <w:p>
+      <w:pPr>
+        <w:spacing w:after="0" w:before="0"/>
+      </w:pPr>
+      <w:r>
+        <w:rPr>
+          <w:rFonts w:ascii="Courier New" w:hAnsi="Courier New"/>
+          <w:sz w:val="18"/>
+        </w:rPr>
+      </w:r>
+    </w:p>
+    <w:p>
+      <w:pPr>
+        <w:spacing w:after="0" w:before="0"/>
+      </w:pPr>
+      <w:r>
+        <w:rPr>
+          <w:rFonts w:ascii="Courier New" w:hAnsi="Courier New"/>
+          <w:sz w:val="18"/>
+        </w:rPr>
         <w:t xml:space="preserve">    private final SimpleTokenizer tokenizer = SimpleTokenizer.INSTANCE;</w:t>
       </w:r>
     </w:p>
@@ -1899,6 +2113,18 @@
           <w:rFonts w:ascii="Courier New" w:hAnsi="Courier New"/>
           <w:sz w:val="18"/>
         </w:rPr>
+        <w:t xml:space="preserve">            token = SLANG.getOrDefault(token, token);              // f*ck / fck -&gt; fuck</w:t>
+      </w:r>
+    </w:p>
+    <w:p>
+      <w:pPr>
+        <w:spacing w:after="0" w:before="0"/>
+      </w:pPr>
+      <w:r>
+        <w:rPr>
+          <w:rFonts w:ascii="Courier New" w:hAnsi="Courier New"/>
+          <w:sz w:val="18"/>
+        </w:rPr>
         <w:t xml:space="preserve">            if (token.length() &gt; 1 &amp;&amp; !STOPWORDS.contains(token)) {</w:t>
       </w:r>
     </w:p>
@@ -2233,7 +2459,19 @@
           <w:rFonts w:ascii="Courier New" w:hAnsi="Courier New"/>
           <w:sz w:val="18"/>
         </w:rPr>
-        <w:t xml:space="preserve">                           .replace('@', 'a').replace('$', 's');</w:t>
+        <w:t xml:space="preserve">                           .replace('@', 'a').replace('$', 's')</w:t>
+      </w:r>
+    </w:p>
+    <w:p>
+      <w:pPr>
+        <w:spacing w:after="0" w:before="0"/>
+      </w:pPr>
+      <w:r>
+        <w:rPr>
+          <w:rFonts w:ascii="Courier New" w:hAnsi="Courier New"/>
+          <w:sz w:val="18"/>
+        </w:rPr>
+        <w:t xml:space="preserve">                           .replace("*", "");                               // f*ck -&gt; fck</w:t>
       </w:r>
     </w:p>
     <w:p>
@@ -9380,6 +9618,18 @@
           <w:rFonts w:ascii="Courier New" w:hAnsi="Courier New"/>
           <w:sz w:val="18"/>
         </w:rPr>
+        <w:t xml:space="preserve">        model.put("slang", new java.util.TreeMap&lt;&gt;(TextPreprocessor.slang()));</w:t>
+      </w:r>
+    </w:p>
+    <w:p>
+      <w:pPr>
+        <w:spacing w:after="0" w:before="0"/>
+      </w:pPr>
+      <w:r>
+        <w:rPr>
+          <w:rFonts w:ascii="Courier New" w:hAnsi="Courier New"/>
+          <w:sz w:val="18"/>
+        </w:rPr>
         <w:t xml:space="preserve">        model.put("terms", terms);</w:t>
       </w:r>
     </w:p>
@@ -23203,7 +23453,19 @@
           <w:rFonts w:ascii="Courier New" w:hAnsi="Courier New"/>
           <w:sz w:val="18"/>
         </w:rPr>
-        <w:t xml:space="preserve">                   .replace(/@/g, 'a').replace(/\$/g, 's');</w:t>
+        <w:t xml:space="preserve">                   .replace(/@/g, 'a').replace(/\$/g, 's')</w:t>
+      </w:r>
+    </w:p>
+    <w:p>
+      <w:pPr>
+        <w:spacing w:after="0" w:before="0"/>
+      </w:pPr>
+      <w:r>
+        <w:rPr>
+          <w:rFonts w:ascii="Courier New" w:hAnsi="Courier New"/>
+          <w:sz w:val="18"/>
+        </w:rPr>
+        <w:t xml:space="preserve">                   .replace(/\*/g, '');                                       // f*ck -&gt; fck</w:t>
       </w:r>
     </w:p>
     <w:p>
@@ -23286,7 +23548,19 @@
           <w:rFonts w:ascii="Courier New" w:hAnsi="Courier New"/>
           <w:sz w:val="18"/>
         </w:rPr>
-        <w:t xml:space="preserve">  function preprocess(text, stopwords) {</w:t>
+        <w:t xml:space="preserve">  function preprocess(text, stopwords, slang) {</w:t>
+      </w:r>
+    </w:p>
+    <w:p>
+      <w:pPr>
+        <w:spacing w:after="0" w:before="0"/>
+      </w:pPr>
+      <w:r>
+        <w:rPr>
+          <w:rFonts w:ascii="Courier New" w:hAnsi="Courier New"/>
+          <w:sz w:val="18"/>
+        </w:rPr>
+        <w:t xml:space="preserve">    slang = slang || {};</w:t>
       </w:r>
     </w:p>
     <w:p>
@@ -23406,7 +23680,19 @@
           <w:rFonts w:ascii="Courier New" w:hAnsi="Courier New"/>
           <w:sz w:val="18"/>
         </w:rPr>
-        <w:t xml:space="preserve">    for (const token of clean.split(new RegExp(JAVA_SPACE + '+'))) {</w:t>
+        <w:t xml:space="preserve">    for (let token of clean.split(new RegExp(JAVA_SPACE + '+'))) {</w:t>
+      </w:r>
+    </w:p>
+    <w:p>
+      <w:pPr>
+        <w:spacing w:after="0" w:before="0"/>
+      </w:pPr>
+      <w:r>
+        <w:rPr>
+          <w:rFonts w:ascii="Courier New" w:hAnsi="Courier New"/>
+          <w:sz w:val="18"/>
+        </w:rPr>
+        <w:t xml:space="preserve">      if (Object.prototype.hasOwnProperty.call(slang, token)) token = slang[token];   // f*ck / fck -&gt; fuck</w:t>
       </w:r>
     </w:p>
     <w:p>
@@ -23585,6 +23871,18 @@
           <w:rFonts w:ascii="Courier New" w:hAnsi="Courier New"/>
           <w:sz w:val="18"/>
         </w:rPr>
+        <w:t xml:space="preserve">      this.slang = json.slang || {};</w:t>
+      </w:r>
+    </w:p>
+    <w:p>
+      <w:pPr>
+        <w:spacing w:after="0" w:before="0"/>
+      </w:pPr>
+      <w:r>
+        <w:rPr>
+          <w:rFonts w:ascii="Courier New" w:hAnsi="Courier New"/>
+          <w:sz w:val="18"/>
+        </w:rPr>
         <w:t xml:space="preserve">      this.vocabulary = new Map(json.terms.map((term, i) =&gt; [term, i]));</w:t>
       </w:r>
     </w:p>
@@ -24146,7 +24444,7 @@
           <w:rFonts w:ascii="Courier New" w:hAnsi="Courier New"/>
           <w:sz w:val="18"/>
         </w:rPr>
-        <w:t xml:space="preserve">      const probabilities = this.probabilities(this.vectorize(preprocess(text, this.stopwords)));</w:t>
+        <w:t xml:space="preserve">      const probabilities = this.probabilities(this.vectorize(preprocess(text, this.stopwords, this.slang)));</w:t>
       </w:r>
     </w:p>
     <w:p>
@@ -27154,7 +27452,7 @@
           <w:rFonts w:ascii="Courier New" w:hAnsi="Courier New"/>
           <w:sz w:val="18"/>
         </w:rPr>
-        <w:t>Dataset size: 1420 messages (80% train / 20% test)</w:t>
+        <w:t>Dataset size: 1520 messages (80% train / 20% test)</w:t>
       </w:r>
     </w:p>
     <w:p>
@@ -27189,19 +27487,19 @@
           <w:rFonts w:ascii="Courier New" w:hAnsi="Courier New"/>
           <w:sz w:val="18"/>
         </w:rPr>
-        <w:t>Naive Bayes        97.5%      96.2%    96.3%     96.2%        0.039</w:t>
-      </w:r>
-    </w:p>
-    <w:p>
-      <w:pPr>
-        <w:spacing w:after="0" w:before="0"/>
-      </w:pPr>
-      <w:r>
-        <w:rPr>
-          <w:rFonts w:ascii="Courier New" w:hAnsi="Courier New"/>
-          <w:sz w:val="18"/>
-        </w:rPr>
-        <w:t>Linear SVM         97.5%      96.1%    95.5%     95.8%        0.036</w:t>
+        <w:t>Naive Bayes        96.4%      96.7%    92.1%     94.2%        0.040</w:t>
+      </w:r>
+    </w:p>
+    <w:p>
+      <w:pPr>
+        <w:spacing w:after="0" w:before="0"/>
+      </w:pPr>
+      <w:r>
+        <w:rPr>
+          <w:rFonts w:ascii="Courier New" w:hAnsi="Courier New"/>
+          <w:sz w:val="18"/>
+        </w:rPr>
+        <w:t>Linear SVM         95.7%      96.1%    91.2%     93.4%        0.039</w:t>
       </w:r>
     </w:p>
     <w:p>
@@ -27248,43 +27546,43 @@
           <w:rFonts w:ascii="Courier New" w:hAnsi="Courier New"/>
           <w:sz w:val="18"/>
         </w:rPr>
-        <w:t>SAFE              98.5%    98.5%     98.5%      196</w:t>
-      </w:r>
-    </w:p>
-    <w:p>
-      <w:pPr>
-        <w:spacing w:after="0" w:before="0"/>
-      </w:pPr>
-      <w:r>
-        <w:rPr>
-          <w:rFonts w:ascii="Courier New" w:hAnsi="Courier New"/>
-          <w:sz w:val="18"/>
-        </w:rPr>
-        <w:t>INSULT           100.0%    93.8%     96.8%       32</w:t>
-      </w:r>
-    </w:p>
-    <w:p>
-      <w:pPr>
-        <w:spacing w:after="0" w:before="0"/>
-      </w:pPr>
-      <w:r>
-        <w:rPr>
-          <w:rFonts w:ascii="Courier New" w:hAnsi="Courier New"/>
-          <w:sz w:val="18"/>
-        </w:rPr>
-        <w:t>THREAT            93.1%    96.4%     94.7%       28</w:t>
-      </w:r>
-    </w:p>
-    <w:p>
-      <w:pPr>
-        <w:spacing w:after="0" w:before="0"/>
-      </w:pPr>
-      <w:r>
-        <w:rPr>
-          <w:rFonts w:ascii="Courier New" w:hAnsi="Courier New"/>
-          <w:sz w:val="18"/>
-        </w:rPr>
-        <w:t>HATE_SPEECH       93.1%    96.4%     94.7%       28</w:t>
+        <w:t>SAFE              96.5%    99.0%     97.7%      196</w:t>
+      </w:r>
+    </w:p>
+    <w:p>
+      <w:pPr>
+        <w:spacing w:after="0" w:before="0"/>
+      </w:pPr>
+      <w:r>
+        <w:rPr>
+          <w:rFonts w:ascii="Courier New" w:hAnsi="Courier New"/>
+          <w:sz w:val="18"/>
+        </w:rPr>
+        <w:t>INSULT            94.4%    98.1%     96.2%       52</w:t>
+      </w:r>
+    </w:p>
+    <w:p>
+      <w:pPr>
+        <w:spacing w:after="0" w:before="0"/>
+      </w:pPr>
+      <w:r>
+        <w:rPr>
+          <w:rFonts w:ascii="Courier New" w:hAnsi="Courier New"/>
+          <w:sz w:val="18"/>
+        </w:rPr>
+        <w:t>THREAT            95.8%    82.1%     88.5%       28</w:t>
+      </w:r>
+    </w:p>
+    <w:p>
+      <w:pPr>
+        <w:spacing w:after="0" w:before="0"/>
+      </w:pPr>
+      <w:r>
+        <w:rPr>
+          <w:rFonts w:ascii="Courier New" w:hAnsi="Courier New"/>
+          <w:sz w:val="18"/>
+        </w:rPr>
+        <w:t>HATE_SPEECH      100.0%    89.3%     94.3%       28</w:t>
       </w:r>
     </w:p>
     <w:p>
@@ -27320,43 +27618,43 @@
           <w:rFonts w:ascii="Courier New" w:hAnsi="Courier New"/>
           <w:sz w:val="18"/>
         </w:rPr>
-        <w:t>SAFE                 193           0           1           2</w:t>
-      </w:r>
-    </w:p>
-    <w:p>
-      <w:pPr>
-        <w:spacing w:after="0" w:before="0"/>
-      </w:pPr>
-      <w:r>
-        <w:rPr>
-          <w:rFonts w:ascii="Courier New" w:hAnsi="Courier New"/>
-          <w:sz w:val="18"/>
-        </w:rPr>
-        <w:t>INSULT                 1          30           1           0</w:t>
-      </w:r>
-    </w:p>
-    <w:p>
-      <w:pPr>
-        <w:spacing w:after="0" w:before="0"/>
-      </w:pPr>
-      <w:r>
-        <w:rPr>
-          <w:rFonts w:ascii="Courier New" w:hAnsi="Courier New"/>
-          <w:sz w:val="18"/>
-        </w:rPr>
-        <w:t>THREAT                 1           0          27           0</w:t>
-      </w:r>
-    </w:p>
-    <w:p>
-      <w:pPr>
-        <w:spacing w:after="0" w:before="0"/>
-      </w:pPr>
-      <w:r>
-        <w:rPr>
-          <w:rFonts w:ascii="Courier New" w:hAnsi="Courier New"/>
-          <w:sz w:val="18"/>
-        </w:rPr>
-        <w:t>HATE_SPEECH            1           0           0          27</w:t>
+        <w:t>SAFE                 194           1           1           0</w:t>
+      </w:r>
+    </w:p>
+    <w:p>
+      <w:pPr>
+        <w:spacing w:after="0" w:before="0"/>
+      </w:pPr>
+      <w:r>
+        <w:rPr>
+          <w:rFonts w:ascii="Courier New" w:hAnsi="Courier New"/>
+          <w:sz w:val="18"/>
+        </w:rPr>
+        <w:t>INSULT                 1          51           0           0</w:t>
+      </w:r>
+    </w:p>
+    <w:p>
+      <w:pPr>
+        <w:spacing w:after="0" w:before="0"/>
+      </w:pPr>
+      <w:r>
+        <w:rPr>
+          <w:rFonts w:ascii="Courier New" w:hAnsi="Courier New"/>
+          <w:sz w:val="18"/>
+        </w:rPr>
+        <w:t>THREAT                 3           2          23           0</w:t>
+      </w:r>
+    </w:p>
+    <w:p>
+      <w:pPr>
+        <w:spacing w:after="0" w:before="0"/>
+      </w:pPr>
+      <w:r>
+        <w:rPr>
+          <w:rFonts w:ascii="Courier New" w:hAnsi="Courier New"/>
+          <w:sz w:val="18"/>
+        </w:rPr>
+        <w:t>HATE_SPEECH            3           0           0          25</w:t>
       </w:r>
     </w:p>
     <w:p>
@@ -27403,43 +27701,43 @@
           <w:rFonts w:ascii="Courier New" w:hAnsi="Courier New"/>
           <w:sz w:val="18"/>
         </w:rPr>
-        <w:t>SAFE              98.5%    99.0%     98.7%      196</w:t>
-      </w:r>
-    </w:p>
-    <w:p>
-      <w:pPr>
-        <w:spacing w:after="0" w:before="0"/>
-      </w:pPr>
-      <w:r>
-        <w:rPr>
-          <w:rFonts w:ascii="Courier New" w:hAnsi="Courier New"/>
-          <w:sz w:val="18"/>
-        </w:rPr>
-        <w:t>INSULT           100.0%    93.8%     96.8%       32</w:t>
-      </w:r>
-    </w:p>
-    <w:p>
-      <w:pPr>
-        <w:spacing w:after="0" w:before="0"/>
-      </w:pPr>
-      <w:r>
-        <w:rPr>
-          <w:rFonts w:ascii="Courier New" w:hAnsi="Courier New"/>
-          <w:sz w:val="18"/>
-        </w:rPr>
-        <w:t>THREAT            92.9%    92.9%     92.9%       28</w:t>
-      </w:r>
-    </w:p>
-    <w:p>
-      <w:pPr>
-        <w:spacing w:after="0" w:before="0"/>
-      </w:pPr>
-      <w:r>
-        <w:rPr>
-          <w:rFonts w:ascii="Courier New" w:hAnsi="Courier New"/>
-          <w:sz w:val="18"/>
-        </w:rPr>
-        <w:t>HATE_SPEECH       93.1%    96.4%     94.7%       28</w:t>
+        <w:t>SAFE              95.6%    99.0%     97.2%      196</w:t>
+      </w:r>
+    </w:p>
+    <w:p>
+      <w:pPr>
+        <w:spacing w:after="0" w:before="0"/>
+      </w:pPr>
+      <w:r>
+        <w:rPr>
+          <w:rFonts w:ascii="Courier New" w:hAnsi="Courier New"/>
+          <w:sz w:val="18"/>
+        </w:rPr>
+        <w:t>INSULT            96.1%    94.2%     95.1%       52</w:t>
+      </w:r>
+    </w:p>
+    <w:p>
+      <w:pPr>
+        <w:spacing w:after="0" w:before="0"/>
+      </w:pPr>
+      <w:r>
+        <w:rPr>
+          <w:rFonts w:ascii="Courier New" w:hAnsi="Courier New"/>
+          <w:sz w:val="18"/>
+        </w:rPr>
+        <w:t>THREAT           100.0%    82.1%     90.2%       28</w:t>
+      </w:r>
+    </w:p>
+    <w:p>
+      <w:pPr>
+        <w:spacing w:after="0" w:before="0"/>
+      </w:pPr>
+      <w:r>
+        <w:rPr>
+          <w:rFonts w:ascii="Courier New" w:hAnsi="Courier New"/>
+          <w:sz w:val="18"/>
+        </w:rPr>
+        <w:t>HATE_SPEECH       92.6%    89.3%     90.9%       28</w:t>
       </w:r>
     </w:p>
     <w:p>
@@ -27475,43 +27773,43 @@
           <w:rFonts w:ascii="Courier New" w:hAnsi="Courier New"/>
           <w:sz w:val="18"/>
         </w:rPr>
-        <w:t>SAFE                 194           0           1           1</w:t>
-      </w:r>
-    </w:p>
-    <w:p>
-      <w:pPr>
-        <w:spacing w:after="0" w:before="0"/>
-      </w:pPr>
-      <w:r>
-        <w:rPr>
-          <w:rFonts w:ascii="Courier New" w:hAnsi="Courier New"/>
-          <w:sz w:val="18"/>
-        </w:rPr>
-        <w:t>INSULT                 1          30           1           0</w:t>
-      </w:r>
-    </w:p>
-    <w:p>
-      <w:pPr>
-        <w:spacing w:after="0" w:before="0"/>
-      </w:pPr>
-      <w:r>
-        <w:rPr>
-          <w:rFonts w:ascii="Courier New" w:hAnsi="Courier New"/>
-          <w:sz w:val="18"/>
-        </w:rPr>
-        <w:t>THREAT                 1           0          26           1</w:t>
-      </w:r>
-    </w:p>
-    <w:p>
-      <w:pPr>
-        <w:spacing w:after="0" w:before="0"/>
-      </w:pPr>
-      <w:r>
-        <w:rPr>
-          <w:rFonts w:ascii="Courier New" w:hAnsi="Courier New"/>
-          <w:sz w:val="18"/>
-        </w:rPr>
-        <w:t>HATE_SPEECH            1           0           0          27</w:t>
+        <w:t>SAFE                 194           0           0           2</w:t>
+      </w:r>
+    </w:p>
+    <w:p>
+      <w:pPr>
+        <w:spacing w:after="0" w:before="0"/>
+      </w:pPr>
+      <w:r>
+        <w:rPr>
+          <w:rFonts w:ascii="Courier New" w:hAnsi="Courier New"/>
+          <w:sz w:val="18"/>
+        </w:rPr>
+        <w:t>INSULT                 3          49           0           0</w:t>
+      </w:r>
+    </w:p>
+    <w:p>
+      <w:pPr>
+        <w:spacing w:after="0" w:before="0"/>
+      </w:pPr>
+      <w:r>
+        <w:rPr>
+          <w:rFonts w:ascii="Courier New" w:hAnsi="Courier New"/>
+          <w:sz w:val="18"/>
+        </w:rPr>
+        <w:t>THREAT                 3           2          23           0</w:t>
+      </w:r>
+    </w:p>
+    <w:p>
+      <w:pPr>
+        <w:spacing w:after="0" w:before="0"/>
+      </w:pPr>
+      <w:r>
+        <w:rPr>
+          <w:rFonts w:ascii="Courier New" w:hAnsi="Courier New"/>
+          <w:sz w:val="18"/>
+        </w:rPr>
+        <w:t>HATE_SPEECH            3           0           0          25</w:t>
       </w:r>
     </w:p>
     <w:p>

</xml_diff>